<commit_message>
Update docs: clarify manual-only failover (no automatic)
- Removed references to automatic failover / Origin Group
- Added explicit callout: all failovers are manual
- Added limitation: manual intervention required if primary fails
- Updated Word document with same changes

Co-authored-by: Copilot <223556219+Copilot@users.noreply.github.com>
</commit_message>
<xml_diff>
--- a/docs/MACP-DR-Option7-Solution.docx
+++ b/docs/MACP-DR-Option7-Solution.docx
@@ -34,7 +34,18 @@
     </w:p>
     <w:p>
       <w:r>
-        <w:t>Option 7 provides proactive failover control for MACP Connect's static web applications (Admin, Agent, Chat portals) using AWS Lambda@Edge and DynamoDB Global Tables. This solution enables manual, controlled failover between us-east-1 (Primary) and us-west-2 (DR) regions with sub-minute switching time.</w:t>
+        <w:t>Option 7 provides manual, controlled failover for MACP Connect's static web applications (Admin, Agent, Chat portals) using AWS Lambda@Edge and DynamoDB Global Tables. This solution enables on-demand failover between us-east-1 (Primary) and us-west-2 (DR) regions with sub-minute switching time.</w:t>
+      </w:r>
+    </w:p>
+    <w:p>
+      <w:r>
+        <w:rPr>
+          <w:b/>
+        </w:rPr>
+        <w:t xml:space="preserve">Key Design Decision: </w:t>
+      </w:r>
+      <w:r>
+        <w:t>No automatic failover. All failovers are explicitly triggered by operators via DynamoDB, ensuring full control over when and why traffic switches regions.</w:t>
       </w:r>
     </w:p>
     <w:p>
@@ -87,7 +98,7 @@
         <w:pStyle w:val="ListBullet"/>
       </w:pPr>
       <w:r>
-        <w:t>4. Lambda signs request and routes to appropriate S3 bucket</w:t>
+        <w:t>4. Lambda signs request and routes to active S3 bucket</w:t>
       </w:r>
     </w:p>
     <w:p>
@@ -95,7 +106,7 @@
         <w:pStyle w:val="ListBullet"/>
       </w:pPr>
       <w:r>
-        <w:t>5. Content served from us-east-1 or us-west-2 based on control signal</w:t>
+        <w:t>5. Content served from us-east-1 or us-west-2 based on DynamoDB setting</w:t>
       </w:r>
     </w:p>
     <w:p>
@@ -206,7 +217,7 @@
           </w:tcPr>
           <w:p>
             <w:r>
-              <w:t>Routes to active region, signs S3 requests (Python 3.12, 128MB)</w:t>
+              <w:t>Routes to active region based on DynamoDB, signs S3 requests (Python 3.12)</w:t>
             </w:r>
           </w:p>
         </w:tc>
@@ -289,6 +300,18 @@
     </w:p>
     <w:p>
       <w:r>
+        <w:rPr>
+          <w:b/>
+        </w:rPr>
+        <w:t xml:space="preserve">Important: </w:t>
+      </w:r>
+      <w:r>
+        <w:t>All failovers are manual. There is no automatic failover if the primary region fails.</w:t>
+      </w:r>
+    </w:p>
+    <w:p/>
+    <w:p>
+      <w:r>
         <w:t>To trigger failover, run the failover script:</w:t>
       </w:r>
     </w:p>
@@ -312,6 +335,36 @@
           <w:rFonts w:ascii="Courier New" w:hAnsi="Courier New"/>
         </w:rPr>
         <w:t>./failover.sh status  # Check current status</w:t>
+      </w:r>
+    </w:p>
+    <w:p/>
+    <w:p>
+      <w:r>
+        <w:t>The script automatically:</w:t>
+      </w:r>
+    </w:p>
+    <w:p>
+      <w:pPr>
+        <w:pStyle w:val="ListBullet"/>
+      </w:pPr>
+      <w:r>
+        <w:t>1. Updates DynamoDB active_region</w:t>
+      </w:r>
+    </w:p>
+    <w:p>
+      <w:pPr>
+        <w:pStyle w:val="ListBullet"/>
+      </w:pPr>
+      <w:r>
+        <w:t>2. Invalidates CloudFront cache</w:t>
+      </w:r>
+    </w:p>
+    <w:p>
+      <w:pPr>
+        <w:pStyle w:val="ListBullet"/>
+      </w:pPr>
+      <w:r>
+        <w:t>3. Verifies the change</w:t>
       </w:r>
     </w:p>
     <w:p/>
@@ -890,10 +943,10 @@
         <w:rPr>
           <w:b/>
         </w:rPr>
-        <w:t xml:space="preserve">Proactive Control: </w:t>
+        <w:t xml:space="preserve">Manual Control Only: </w:t>
       </w:r>
       <w:r>
-        <w:t>Failover on-demand, not just on failure</w:t>
+        <w:t>No automatic failover - operators decide when to switch</w:t>
       </w:r>
     </w:p>
     <w:p>
@@ -964,6 +1017,54 @@
       </w:r>
       <w:r>
         <w:t>DynamoDB records who/when for failovers</w:t>
+      </w:r>
+    </w:p>
+    <w:p>
+      <w:pPr>
+        <w:pStyle w:val="Heading1"/>
+      </w:pPr>
+      <w:r>
+        <w:t>Limitations</w:t>
+      </w:r>
+    </w:p>
+    <w:p>
+      <w:pPr>
+        <w:pStyle w:val="ListBullet"/>
+      </w:pPr>
+      <w:r>
+        <w:t>Lambda@Edge adds latency (~50ms per request)</w:t>
+      </w:r>
+    </w:p>
+    <w:p>
+      <w:pPr>
+        <w:pStyle w:val="ListBullet"/>
+      </w:pPr>
+      <w:r>
+        <w:t>Requires cache invalidation for immediate failover</w:t>
+      </w:r>
+    </w:p>
+    <w:p>
+      <w:pPr>
+        <w:pStyle w:val="ListBullet"/>
+      </w:pPr>
+      <w:r>
+        <w:t>Lambda@Edge doesn't support ARM64 (must use x86_64)</w:t>
+      </w:r>
+    </w:p>
+    <w:p>
+      <w:pPr>
+        <w:pStyle w:val="ListBullet"/>
+      </w:pPr>
+      <w:r>
+        <w:t>Content must be synced to both S3 buckets</w:t>
+      </w:r>
+    </w:p>
+    <w:p>
+      <w:pPr>
+        <w:pStyle w:val="ListBullet"/>
+      </w:pPr>
+      <w:r>
+        <w:t>No automatic failover - if primary region fails, manual intervention required</w:t>
       </w:r>
     </w:p>
     <w:p>

</xml_diff>